<commit_message>
Update resume content and enhance experience descriptions for clarity and impact
Co-authored-by: Copilot <copilot@github.com>
</commit_message>
<xml_diff>
--- a/public/Joseph_Thompson_Resume.docx
+++ b/public/Joseph_Thompson_Resume.docx
@@ -430,6 +430,14 @@
         </w:rPr>
         <w:t>Microservices, SOA, Agile (Scrum, Kanban), CI/CD, Object-Oriented Programming, Software Testing</w:t>
       </w:r>
+      <w:r>
+        <w:rPr>
+          <w:rFonts w:ascii="Cambria" w:hAnsi="Cambria" w:cs="Times New Roman"/>
+          <w:sz w:val="20"/>
+          <w:szCs w:val="20"/>
+        </w:rPr>
+        <w:t>, Generative AI</w:t>
+      </w:r>
     </w:p>
     <w:p>
       <w:pPr>
@@ -672,48 +680,18 @@
           <w:szCs w:val="20"/>
         </w:rPr>
         <w:tab/>
-        <w:t xml:space="preserve">              </w:t>
-      </w:r>
-      <w:r>
-        <w:rPr>
-          <w:rFonts w:ascii="Cambria" w:hAnsi="Cambria" w:cs="Times New Roman"/>
-          <w:b/>
-          <w:bCs/>
-          <w:sz w:val="20"/>
-          <w:szCs w:val="20"/>
-        </w:rPr>
-        <w:t xml:space="preserve">     </w:t>
-      </w:r>
-      <w:r>
-        <w:rPr>
-          <w:rFonts w:ascii="Cambria" w:hAnsi="Cambria" w:cs="Times New Roman"/>
-          <w:b/>
-          <w:bCs/>
-          <w:sz w:val="20"/>
-          <w:szCs w:val="20"/>
-        </w:rPr>
-        <w:t xml:space="preserve"> </w:t>
-      </w:r>
-      <w:r>
-        <w:rPr>
-          <w:rFonts w:ascii="Cambria" w:hAnsi="Cambria" w:cs="Times New Roman"/>
-          <w:sz w:val="20"/>
-          <w:szCs w:val="20"/>
-        </w:rPr>
-        <w:t>January 2022</w:t>
-      </w:r>
-      <w:r>
-        <w:rPr>
-          <w:rFonts w:ascii="Cambria" w:hAnsi="Cambria" w:cs="Times New Roman"/>
-          <w:sz w:val="20"/>
-          <w:szCs w:val="20"/>
-        </w:rPr>
-        <w:t xml:space="preserve"> - Current</w:t>
       </w:r>
     </w:p>
     <w:p>
       <w:pPr>
         <w:spacing w:line="360" w:lineRule="auto"/>
+        <w:rPr>
+          <w:rFonts w:ascii="Cambria" w:hAnsi="Cambria" w:cs="Times New Roman"/>
+          <w:sz w:val="20"/>
+          <w:szCs w:val="20"/>
+        </w:rPr>
+      </w:pPr>
+      <w:r>
         <w:rPr>
           <w:rFonts w:ascii="Cambria" w:hAnsi="Cambria" w:cs="Times New Roman"/>
           <w:i/>
@@ -721,7 +699,8 @@
           <w:sz w:val="20"/>
           <w:szCs w:val="20"/>
         </w:rPr>
-      </w:pPr>
+        <w:t xml:space="preserve">Senior </w:t>
+      </w:r>
       <w:r>
         <w:rPr>
           <w:rFonts w:ascii="Cambria" w:hAnsi="Cambria" w:cs="Times New Roman"/>
@@ -730,7 +709,382 @@
           <w:sz w:val="20"/>
           <w:szCs w:val="20"/>
         </w:rPr>
+        <w:t xml:space="preserve">Software Engineer - </w:t>
+      </w:r>
+      <w:r>
+        <w:rPr>
+          <w:rFonts w:ascii="Cambria" w:hAnsi="Cambria" w:cs="Times New Roman"/>
+          <w:i/>
+          <w:iCs/>
+          <w:sz w:val="20"/>
+          <w:szCs w:val="20"/>
+        </w:rPr>
+        <w:t>S</w:t>
+      </w:r>
+      <w:r>
+        <w:rPr>
+          <w:rFonts w:ascii="Cambria" w:hAnsi="Cambria" w:cs="Times New Roman"/>
+          <w:i/>
+          <w:iCs/>
+          <w:sz w:val="20"/>
+          <w:szCs w:val="20"/>
+        </w:rPr>
+        <w:t>AVP, Charlotte, NC</w:t>
+      </w:r>
+      <w:r>
+        <w:rPr>
+          <w:rFonts w:ascii="Cambria" w:hAnsi="Cambria" w:cs="Times New Roman"/>
+          <w:b/>
+          <w:bCs/>
+          <w:sz w:val="20"/>
+          <w:szCs w:val="20"/>
+        </w:rPr>
+        <w:t xml:space="preserve">                                                                                                            </w:t>
+      </w:r>
+      <w:r>
+        <w:rPr>
+          <w:rFonts w:ascii="Cambria" w:hAnsi="Cambria" w:cs="Times New Roman"/>
+          <w:sz w:val="20"/>
+          <w:szCs w:val="20"/>
+        </w:rPr>
+        <w:t>February 2026 – Current</w:t>
+      </w:r>
+    </w:p>
+    <w:p>
+      <w:pPr>
+        <w:pStyle w:val="ListParagraph"/>
+        <w:numPr>
+          <w:ilvl w:val="0"/>
+          <w:numId w:val="16"/>
+        </w:numPr>
+        <w:spacing w:line="360" w:lineRule="auto"/>
+        <w:rPr>
+          <w:rFonts w:ascii="Cambria" w:hAnsi="Cambria" w:cs="Times New Roman"/>
+          <w:sz w:val="20"/>
+          <w:szCs w:val="20"/>
+        </w:rPr>
+      </w:pPr>
+      <w:r>
+        <w:rPr>
+          <w:rFonts w:ascii="Cambria" w:hAnsi="Cambria" w:cs="Times New Roman"/>
+          <w:b/>
+          <w:bCs/>
+          <w:sz w:val="20"/>
+          <w:szCs w:val="20"/>
+        </w:rPr>
+        <w:t>Led</w:t>
+      </w:r>
+      <w:r>
+        <w:rPr>
+          <w:rFonts w:ascii="Cambria" w:hAnsi="Cambria" w:cs="Times New Roman"/>
+          <w:sz w:val="20"/>
+          <w:szCs w:val="20"/>
+        </w:rPr>
+        <w:t xml:space="preserve"> critical Business Continuity Planning (BCP) by successfully executing failover exercises, ensuring zero service interruption while seamlessly routing live traffic across multiple data centers. </w:t>
+      </w:r>
+    </w:p>
+    <w:p>
+      <w:pPr>
+        <w:pStyle w:val="ListParagraph"/>
+        <w:numPr>
+          <w:ilvl w:val="0"/>
+          <w:numId w:val="16"/>
+        </w:numPr>
+        <w:spacing w:line="360" w:lineRule="auto"/>
+        <w:rPr>
+          <w:rFonts w:ascii="Cambria" w:hAnsi="Cambria" w:cs="Times New Roman"/>
+          <w:sz w:val="20"/>
+          <w:szCs w:val="20"/>
+        </w:rPr>
+      </w:pPr>
+      <w:r>
+        <w:rPr>
+          <w:rFonts w:ascii="Cambria" w:hAnsi="Cambria" w:cs="Times New Roman"/>
+          <w:b/>
+          <w:bCs/>
+          <w:sz w:val="20"/>
+          <w:szCs w:val="20"/>
+        </w:rPr>
+        <w:t>Spearheaded</w:t>
+      </w:r>
+      <w:r>
+        <w:rPr>
+          <w:rFonts w:ascii="Cambria" w:hAnsi="Cambria" w:cs="Times New Roman"/>
+          <w:sz w:val="20"/>
+          <w:szCs w:val="20"/>
+        </w:rPr>
+        <w:t xml:space="preserve"> complex, enterprise-wide migration initiatives (DCMS/DC Exit), including architecting and executing database migrations from on-prem heritage systems to modern cloud environments (NGDC). </w:t>
+      </w:r>
+    </w:p>
+    <w:p>
+      <w:pPr>
+        <w:pStyle w:val="ListParagraph"/>
+        <w:numPr>
+          <w:ilvl w:val="0"/>
+          <w:numId w:val="16"/>
+        </w:numPr>
+        <w:spacing w:line="360" w:lineRule="auto"/>
+        <w:rPr>
+          <w:rFonts w:ascii="Cambria" w:hAnsi="Cambria" w:cs="Times New Roman"/>
+          <w:sz w:val="20"/>
+          <w:szCs w:val="20"/>
+        </w:rPr>
+      </w:pPr>
+      <w:r>
+        <w:rPr>
+          <w:rFonts w:ascii="Cambria" w:hAnsi="Cambria" w:cs="Times New Roman"/>
+          <w:b/>
+          <w:bCs/>
+          <w:sz w:val="20"/>
+          <w:szCs w:val="20"/>
+        </w:rPr>
+        <w:t>Drove</w:t>
+      </w:r>
+      <w:r>
+        <w:rPr>
+          <w:rFonts w:ascii="Cambria" w:hAnsi="Cambria" w:cs="Times New Roman"/>
+          <w:sz w:val="20"/>
+          <w:szCs w:val="20"/>
+        </w:rPr>
+        <w:t xml:space="preserve"> advanced Generative AI adoption by building and maintaining a centralized knowledge hub, standardizing usage guidelines, and accelerating organizational AI literacy across multiple development teams. </w:t>
+      </w:r>
+    </w:p>
+    <w:p>
+      <w:pPr>
+        <w:pStyle w:val="ListParagraph"/>
+        <w:numPr>
+          <w:ilvl w:val="0"/>
+          <w:numId w:val="16"/>
+        </w:numPr>
+        <w:spacing w:line="360" w:lineRule="auto"/>
+        <w:rPr>
+          <w:rFonts w:ascii="Cambria" w:hAnsi="Cambria" w:cs="Times New Roman"/>
+          <w:sz w:val="20"/>
+          <w:szCs w:val="20"/>
+        </w:rPr>
+      </w:pPr>
+      <w:r>
+        <w:rPr>
+          <w:rFonts w:ascii="Cambria" w:hAnsi="Cambria" w:cs="Times New Roman"/>
+          <w:b/>
+          <w:bCs/>
+          <w:sz w:val="20"/>
+          <w:szCs w:val="20"/>
+        </w:rPr>
+        <w:t>Provided</w:t>
+      </w:r>
+      <w:r>
+        <w:rPr>
+          <w:rFonts w:ascii="Cambria" w:hAnsi="Cambria" w:cs="Times New Roman"/>
+          <w:sz w:val="20"/>
+          <w:szCs w:val="20"/>
+        </w:rPr>
+        <w:t xml:space="preserve"> technical leadership for critical production deployments and modernization efforts, proactively owning deployment lifecycles—including acting as lead in the absence of Principal Engineers—to guarantee on-schedule, continuous service delivery. </w:t>
+      </w:r>
+    </w:p>
+    <w:p>
+      <w:pPr>
+        <w:pStyle w:val="ListParagraph"/>
+        <w:numPr>
+          <w:ilvl w:val="0"/>
+          <w:numId w:val="16"/>
+        </w:numPr>
+        <w:spacing w:line="360" w:lineRule="auto"/>
+        <w:rPr>
+          <w:rFonts w:ascii="Cambria" w:hAnsi="Cambria" w:cs="Times New Roman"/>
+          <w:sz w:val="20"/>
+          <w:szCs w:val="20"/>
+        </w:rPr>
+      </w:pPr>
+      <w:r>
+        <w:rPr>
+          <w:rFonts w:ascii="Cambria" w:hAnsi="Cambria" w:cs="Times New Roman"/>
+          <w:b/>
+          <w:bCs/>
+          <w:sz w:val="20"/>
+          <w:szCs w:val="20"/>
+        </w:rPr>
+        <w:t>Maintained</w:t>
+      </w:r>
+      <w:r>
+        <w:rPr>
+          <w:rFonts w:ascii="Cambria" w:hAnsi="Cambria" w:cs="Times New Roman"/>
+          <w:sz w:val="20"/>
+          <w:szCs w:val="20"/>
+        </w:rPr>
+        <w:t xml:space="preserve"> exceptional operational discipline across all supported migration and deployment activities, resulting in zero Sev-1 or Sev-2 incidents attributable to work, demonstrating expert risk management and stability assurance. </w:t>
+      </w:r>
+    </w:p>
+    <w:p>
+      <w:pPr>
+        <w:pStyle w:val="ListParagraph"/>
+        <w:numPr>
+          <w:ilvl w:val="0"/>
+          <w:numId w:val="16"/>
+        </w:numPr>
+        <w:spacing w:line="360" w:lineRule="auto"/>
+        <w:rPr>
+          <w:rFonts w:ascii="Cambria" w:hAnsi="Cambria" w:cs="Times New Roman"/>
+          <w:sz w:val="20"/>
+          <w:szCs w:val="20"/>
+        </w:rPr>
+      </w:pPr>
+      <w:r>
+        <w:rPr>
+          <w:rFonts w:ascii="Cambria" w:hAnsi="Cambria" w:cs="Times New Roman"/>
+          <w:b/>
+          <w:bCs/>
+          <w:sz w:val="20"/>
+          <w:szCs w:val="20"/>
+        </w:rPr>
+        <w:t>Elevated</w:t>
+      </w:r>
+      <w:r>
+        <w:rPr>
+          <w:rFonts w:ascii="Cambria" w:hAnsi="Cambria" w:cs="Times New Roman"/>
+          <w:sz w:val="20"/>
+          <w:szCs w:val="20"/>
+        </w:rPr>
+        <w:t xml:space="preserve"> development efficiency by integrating advanced AI tooling (GitHub Copilot Agent/Edit modes) into workflows, accelerating code generation and review processes while ensuring 100% test coverage. </w:t>
+      </w:r>
+    </w:p>
+    <w:p>
+      <w:pPr>
+        <w:pStyle w:val="ListParagraph"/>
+        <w:numPr>
+          <w:ilvl w:val="0"/>
+          <w:numId w:val="16"/>
+        </w:numPr>
+        <w:spacing w:line="360" w:lineRule="auto"/>
+        <w:rPr>
+          <w:rFonts w:ascii="Cambria" w:hAnsi="Cambria" w:cs="Times New Roman"/>
+          <w:sz w:val="20"/>
+          <w:szCs w:val="20"/>
+        </w:rPr>
+      </w:pPr>
+      <w:r>
+        <w:rPr>
+          <w:rFonts w:ascii="Cambria" w:hAnsi="Cambria" w:cs="Times New Roman"/>
+          <w:b/>
+          <w:bCs/>
+          <w:sz w:val="20"/>
+          <w:szCs w:val="20"/>
+        </w:rPr>
+        <w:t>Served</w:t>
+      </w:r>
+      <w:r>
+        <w:rPr>
+          <w:rFonts w:ascii="Cambria" w:hAnsi="Cambria" w:cs="Times New Roman"/>
+          <w:sz w:val="20"/>
+          <w:szCs w:val="20"/>
+        </w:rPr>
+        <w:t xml:space="preserve"> as a key subject matter expert (SME) across multiple Scrum teams on modernization initiatives, resolving complex technical impediments and establishing alignment through the initial and continuous delivery phases. </w:t>
+      </w:r>
+    </w:p>
+    <w:p>
+      <w:pPr>
+        <w:pStyle w:val="ListParagraph"/>
+        <w:numPr>
+          <w:ilvl w:val="0"/>
+          <w:numId w:val="16"/>
+        </w:numPr>
+        <w:spacing w:line="360" w:lineRule="auto"/>
+        <w:rPr>
+          <w:rFonts w:ascii="Cambria" w:hAnsi="Cambria" w:cs="Times New Roman"/>
+          <w:sz w:val="20"/>
+          <w:szCs w:val="20"/>
+        </w:rPr>
+      </w:pPr>
+      <w:r>
+        <w:rPr>
+          <w:rFonts w:ascii="Cambria" w:hAnsi="Cambria" w:cs="Times New Roman"/>
+          <w:b/>
+          <w:bCs/>
+          <w:sz w:val="20"/>
+          <w:szCs w:val="20"/>
+        </w:rPr>
+        <w:t>Developed</w:t>
+      </w:r>
+      <w:r>
+        <w:rPr>
+          <w:rFonts w:ascii="Cambria" w:hAnsi="Cambria" w:cs="Times New Roman"/>
+          <w:sz w:val="20"/>
+          <w:szCs w:val="20"/>
+        </w:rPr>
+        <w:t xml:space="preserve"> custom AI agents for core business processes—such as streamlining fraud remediation—and implementing automated pre-commit checks to enforce organizational security standards at the code level. </w:t>
+      </w:r>
+    </w:p>
+    <w:p>
+      <w:pPr>
+        <w:pStyle w:val="ListParagraph"/>
+        <w:numPr>
+          <w:ilvl w:val="0"/>
+          <w:numId w:val="16"/>
+        </w:numPr>
+        <w:spacing w:line="360" w:lineRule="auto"/>
+        <w:rPr>
+          <w:rFonts w:ascii="Cambria" w:hAnsi="Cambria" w:cs="Times New Roman"/>
+          <w:sz w:val="20"/>
+          <w:szCs w:val="20"/>
+        </w:rPr>
+      </w:pPr>
+      <w:r>
+        <w:rPr>
+          <w:rFonts w:ascii="Cambria" w:hAnsi="Cambria" w:cs="Times New Roman"/>
+          <w:b/>
+          <w:bCs/>
+          <w:sz w:val="20"/>
+          <w:szCs w:val="20"/>
+        </w:rPr>
+        <w:t>Cultivated</w:t>
+      </w:r>
+      <w:r>
+        <w:rPr>
+          <w:rFonts w:ascii="Cambria" w:hAnsi="Cambria" w:cs="Times New Roman"/>
+          <w:sz w:val="20"/>
+          <w:szCs w:val="20"/>
+        </w:rPr>
+        <w:t xml:space="preserve"> deep cross-functional relationships by participating in mentoring programs and leading internal awareness forums, translating complex technical concepts into actionable knowledge for broad engineering adoption.</w:t>
+      </w:r>
+    </w:p>
+    <w:p>
+      <w:pPr>
+        <w:spacing w:line="360" w:lineRule="auto"/>
+        <w:rPr>
+          <w:rFonts w:ascii="Cambria" w:hAnsi="Cambria" w:cs="Times New Roman"/>
+          <w:i/>
+          <w:iCs/>
+          <w:sz w:val="20"/>
+          <w:szCs w:val="20"/>
+        </w:rPr>
+      </w:pPr>
+      <w:r>
+        <w:rPr>
+          <w:rFonts w:ascii="Cambria" w:hAnsi="Cambria" w:cs="Times New Roman"/>
+          <w:i/>
+          <w:iCs/>
+          <w:sz w:val="20"/>
+          <w:szCs w:val="20"/>
+        </w:rPr>
         <w:t>Software Engineer - AVP, Charlotte, NC</w:t>
+      </w:r>
+      <w:r>
+        <w:rPr>
+          <w:rFonts w:ascii="Cambria" w:hAnsi="Cambria" w:cs="Times New Roman"/>
+          <w:b/>
+          <w:bCs/>
+          <w:sz w:val="20"/>
+          <w:szCs w:val="20"/>
+        </w:rPr>
+        <w:t xml:space="preserve">                                                                                                                </w:t>
+      </w:r>
+      <w:r>
+        <w:rPr>
+          <w:rFonts w:ascii="Cambria" w:hAnsi="Cambria" w:cs="Times New Roman"/>
+          <w:sz w:val="20"/>
+          <w:szCs w:val="20"/>
+        </w:rPr>
+        <w:t>February 2023 – January 2026</w:t>
       </w:r>
     </w:p>
     <w:p>
@@ -770,7 +1124,16 @@
           <w:sz w:val="20"/>
           <w:szCs w:val="20"/>
         </w:rPr>
-        <w:t>multiple high-impact cloud migrations, seamlessly transitioning from on-premises VMs to Pivotal Cloud Foundry (PCF) and later pivoting to a robust Kubernetes-based architecture on OpenShift Container Platform (OCP). Directed the seamless relocation of Java and React components while expertly configuring Helm charts to streamline environment-specific deployments and enhance operational efficiency.</w:t>
+        <w:t xml:space="preserve">multiple high-impact cloud migrations, seamlessly transitioning from on-premises VMs to Pivotal Cloud Foundry (PCF) and later pivoting to a robust Kubernetes-based architecture on OpenShift Container Platform (OCP). </w:t>
+      </w:r>
+      <w:r>
+        <w:rPr>
+          <w:rFonts w:ascii="Cambria" w:hAnsi="Cambria"/>
+          <w:sz w:val="20"/>
+          <w:szCs w:val="20"/>
+        </w:rPr>
+        <w:lastRenderedPageBreak/>
+        <w:t>Directed the seamless relocation of Java and React components while expertly configuring Helm charts to streamline environment-specific deployments and enhance operational efficiency.</w:t>
       </w:r>
     </w:p>
     <w:p>
@@ -1034,23 +1397,7 @@
           <w:sz w:val="20"/>
           <w:szCs w:val="20"/>
         </w:rPr>
-        <w:t xml:space="preserve">GitHub Copilot to generate test cases, refactor code for runtime efficiency, identify and mitigate security vulnerabilities (e.g., SQL injection, XSS, CSRF, insecure authentication, data exposure), and resolve errors </w:t>
-      </w:r>
-      <w:r>
-        <w:rPr>
-          <w:rFonts w:ascii="Cambria" w:hAnsi="Cambria"/>
-          <w:sz w:val="20"/>
-          <w:szCs w:val="20"/>
-        </w:rPr>
-        <w:t>rapidly reducing</w:t>
-      </w:r>
-      <w:r>
-        <w:rPr>
-          <w:rFonts w:ascii="Cambria" w:hAnsi="Cambria"/>
-          <w:sz w:val="20"/>
-          <w:szCs w:val="20"/>
-        </w:rPr>
-        <w:t xml:space="preserve"> development/testing time, minimizing debugging, accelerating cycles, and enhancing security for Java</w:t>
+        <w:t>GitHub Copilot to generate test cases, refactor code for runtime efficiency, identify and mitigate security vulnerabilities (e.g., SQL injection, XSS, CSRF, insecure authentication, data exposure), and resolve errors rapidly reducing development/testing time, minimizing debugging, accelerating cycles, and enhancing security for Java</w:t>
       </w:r>
       <w:r>
         <w:rPr>
@@ -1123,6 +1470,338 @@
       <w:pPr>
         <w:spacing w:line="360" w:lineRule="auto"/>
         <w:rPr>
+          <w:rFonts w:ascii="Cambria" w:hAnsi="Cambria" w:cs="Times New Roman"/>
+          <w:sz w:val="20"/>
+          <w:szCs w:val="20"/>
+        </w:rPr>
+      </w:pPr>
+      <w:r>
+        <w:rPr>
+          <w:rFonts w:ascii="Cambria" w:hAnsi="Cambria" w:cs="Times New Roman"/>
+          <w:i/>
+          <w:iCs/>
+          <w:sz w:val="20"/>
+          <w:szCs w:val="20"/>
+        </w:rPr>
+        <w:t>Technology Analyst</w:t>
+      </w:r>
+      <w:r>
+        <w:rPr>
+          <w:rFonts w:ascii="Cambria" w:hAnsi="Cambria" w:cs="Times New Roman"/>
+          <w:i/>
+          <w:iCs/>
+          <w:sz w:val="20"/>
+          <w:szCs w:val="20"/>
+        </w:rPr>
+        <w:t xml:space="preserve"> - </w:t>
+      </w:r>
+      <w:r>
+        <w:rPr>
+          <w:rFonts w:ascii="Cambria" w:hAnsi="Cambria" w:cs="Times New Roman"/>
+          <w:i/>
+          <w:iCs/>
+          <w:sz w:val="20"/>
+          <w:szCs w:val="20"/>
+        </w:rPr>
+        <w:t>Analyst</w:t>
+      </w:r>
+      <w:r>
+        <w:rPr>
+          <w:rFonts w:ascii="Cambria" w:hAnsi="Cambria" w:cs="Times New Roman"/>
+          <w:i/>
+          <w:iCs/>
+          <w:sz w:val="20"/>
+          <w:szCs w:val="20"/>
+        </w:rPr>
+        <w:t>, Charlotte, NC</w:t>
+      </w:r>
+      <w:r>
+        <w:rPr>
+          <w:rFonts w:ascii="Cambria" w:hAnsi="Cambria" w:cs="Times New Roman"/>
+          <w:b/>
+          <w:bCs/>
+          <w:sz w:val="20"/>
+          <w:szCs w:val="20"/>
+        </w:rPr>
+        <w:t xml:space="preserve">                                                                                                           </w:t>
+      </w:r>
+      <w:r>
+        <w:rPr>
+          <w:rFonts w:ascii="Cambria" w:hAnsi="Cambria" w:cs="Times New Roman"/>
+          <w:sz w:val="20"/>
+          <w:szCs w:val="20"/>
+        </w:rPr>
+        <w:t>January 2022 – January 2023</w:t>
+      </w:r>
+    </w:p>
+    <w:p>
+      <w:pPr>
+        <w:pStyle w:val="ListParagraph"/>
+        <w:numPr>
+          <w:ilvl w:val="0"/>
+          <w:numId w:val="14"/>
+        </w:numPr>
+        <w:spacing w:line="360" w:lineRule="auto"/>
+        <w:rPr>
+          <w:rFonts w:ascii="Cambria" w:hAnsi="Cambria" w:cs="Times New Roman"/>
+          <w:sz w:val="20"/>
+          <w:szCs w:val="20"/>
+        </w:rPr>
+      </w:pPr>
+      <w:r>
+        <w:rPr>
+          <w:rFonts w:ascii="Cambria" w:hAnsi="Cambria" w:cs="Times New Roman"/>
+          <w:b/>
+          <w:bCs/>
+          <w:sz w:val="20"/>
+          <w:szCs w:val="20"/>
+        </w:rPr>
+        <w:t>Applied</w:t>
+      </w:r>
+      <w:r>
+        <w:rPr>
+          <w:rFonts w:ascii="Cambria" w:hAnsi="Cambria" w:cs="Times New Roman"/>
+          <w:sz w:val="20"/>
+          <w:szCs w:val="20"/>
+        </w:rPr>
+        <w:t xml:space="preserve"> Agile and Scrum methodologies, participating in daily stand‑ups, sprint planning, and retrospectives to support on‑time software delivery.</w:t>
+      </w:r>
+    </w:p>
+    <w:p>
+      <w:pPr>
+        <w:pStyle w:val="ListParagraph"/>
+        <w:numPr>
+          <w:ilvl w:val="0"/>
+          <w:numId w:val="14"/>
+        </w:numPr>
+        <w:spacing w:line="360" w:lineRule="auto"/>
+        <w:rPr>
+          <w:rFonts w:ascii="Cambria" w:hAnsi="Cambria" w:cs="Times New Roman"/>
+          <w:sz w:val="20"/>
+          <w:szCs w:val="20"/>
+        </w:rPr>
+      </w:pPr>
+      <w:r>
+        <w:rPr>
+          <w:rFonts w:ascii="Cambria" w:hAnsi="Cambria" w:cs="Times New Roman"/>
+          <w:b/>
+          <w:bCs/>
+          <w:sz w:val="20"/>
+          <w:szCs w:val="20"/>
+        </w:rPr>
+        <w:t>Managed</w:t>
+      </w:r>
+      <w:r>
+        <w:rPr>
+          <w:rFonts w:ascii="Cambria" w:hAnsi="Cambria" w:cs="Times New Roman"/>
+          <w:sz w:val="20"/>
+          <w:szCs w:val="20"/>
+        </w:rPr>
+        <w:t xml:space="preserve"> and completed Jira user stories, consistently meeting sprint goals and delivery commitments. </w:t>
+      </w:r>
+    </w:p>
+    <w:p>
+      <w:pPr>
+        <w:pStyle w:val="ListParagraph"/>
+        <w:numPr>
+          <w:ilvl w:val="0"/>
+          <w:numId w:val="14"/>
+        </w:numPr>
+        <w:spacing w:line="360" w:lineRule="auto"/>
+        <w:rPr>
+          <w:rFonts w:ascii="Cambria" w:hAnsi="Cambria" w:cs="Times New Roman"/>
+          <w:sz w:val="20"/>
+          <w:szCs w:val="20"/>
+        </w:rPr>
+      </w:pPr>
+      <w:r>
+        <w:rPr>
+          <w:rFonts w:ascii="Cambria" w:hAnsi="Cambria" w:cs="Times New Roman"/>
+          <w:b/>
+          <w:bCs/>
+          <w:sz w:val="20"/>
+          <w:szCs w:val="20"/>
+        </w:rPr>
+        <w:t>Enhanced</w:t>
+      </w:r>
+      <w:r>
+        <w:rPr>
+          <w:rFonts w:ascii="Cambria" w:hAnsi="Cambria" w:cs="Times New Roman"/>
+          <w:sz w:val="20"/>
+          <w:szCs w:val="20"/>
+        </w:rPr>
+        <w:t xml:space="preserve"> Spring Boot application codebases, improving functionality and performance to streamline fraud claim processing workflows. </w:t>
+      </w:r>
+    </w:p>
+    <w:p>
+      <w:pPr>
+        <w:pStyle w:val="ListParagraph"/>
+        <w:numPr>
+          <w:ilvl w:val="0"/>
+          <w:numId w:val="14"/>
+        </w:numPr>
+        <w:spacing w:line="360" w:lineRule="auto"/>
+        <w:rPr>
+          <w:rFonts w:ascii="Cambria" w:hAnsi="Cambria" w:cs="Times New Roman"/>
+          <w:sz w:val="20"/>
+          <w:szCs w:val="20"/>
+        </w:rPr>
+      </w:pPr>
+      <w:r>
+        <w:rPr>
+          <w:rFonts w:ascii="Cambria" w:hAnsi="Cambria" w:cs="Times New Roman"/>
+          <w:b/>
+          <w:bCs/>
+          <w:sz w:val="20"/>
+          <w:szCs w:val="20"/>
+        </w:rPr>
+        <w:t>Developed</w:t>
+      </w:r>
+      <w:r>
+        <w:rPr>
+          <w:rFonts w:ascii="Cambria" w:hAnsi="Cambria" w:cs="Times New Roman"/>
+          <w:sz w:val="20"/>
+          <w:szCs w:val="20"/>
+        </w:rPr>
+        <w:t xml:space="preserve"> and executed test scripts to validate application functionality, performance, and conformance to technical requirements. </w:t>
+      </w:r>
+    </w:p>
+    <w:p>
+      <w:pPr>
+        <w:pStyle w:val="ListParagraph"/>
+        <w:numPr>
+          <w:ilvl w:val="0"/>
+          <w:numId w:val="14"/>
+        </w:numPr>
+        <w:spacing w:line="360" w:lineRule="auto"/>
+        <w:rPr>
+          <w:rFonts w:ascii="Cambria" w:hAnsi="Cambria" w:cs="Times New Roman"/>
+          <w:sz w:val="20"/>
+          <w:szCs w:val="20"/>
+        </w:rPr>
+      </w:pPr>
+      <w:r>
+        <w:rPr>
+          <w:rFonts w:ascii="Cambria" w:hAnsi="Cambria" w:cs="Times New Roman"/>
+          <w:b/>
+          <w:bCs/>
+          <w:sz w:val="20"/>
+          <w:szCs w:val="20"/>
+        </w:rPr>
+        <w:t>Authored</w:t>
+      </w:r>
+      <w:r>
+        <w:rPr>
+          <w:rFonts w:ascii="Cambria" w:hAnsi="Cambria" w:cs="Times New Roman"/>
+          <w:sz w:val="20"/>
+          <w:szCs w:val="20"/>
+        </w:rPr>
+        <w:t xml:space="preserve"> and maintained technical documentation in code repositories to support maintainability, usability, and team knowledge transfer. </w:t>
+      </w:r>
+    </w:p>
+    <w:p>
+      <w:pPr>
+        <w:pStyle w:val="ListParagraph"/>
+        <w:numPr>
+          <w:ilvl w:val="0"/>
+          <w:numId w:val="14"/>
+        </w:numPr>
+        <w:spacing w:line="360" w:lineRule="auto"/>
+        <w:rPr>
+          <w:rFonts w:ascii="Cambria" w:hAnsi="Cambria" w:cs="Times New Roman"/>
+          <w:sz w:val="20"/>
+          <w:szCs w:val="20"/>
+        </w:rPr>
+      </w:pPr>
+      <w:r>
+        <w:rPr>
+          <w:rFonts w:ascii="Cambria" w:hAnsi="Cambria" w:cs="Times New Roman"/>
+          <w:b/>
+          <w:bCs/>
+          <w:sz w:val="20"/>
+          <w:szCs w:val="20"/>
+        </w:rPr>
+        <w:t>Supported</w:t>
+      </w:r>
+      <w:r>
+        <w:rPr>
+          <w:rFonts w:ascii="Cambria" w:hAnsi="Cambria" w:cs="Times New Roman"/>
+          <w:sz w:val="20"/>
+          <w:szCs w:val="20"/>
+        </w:rPr>
+        <w:t xml:space="preserve"> pilot and production deployments, ensuring stable releases and smooth operational transitions.</w:t>
+      </w:r>
+    </w:p>
+    <w:p>
+      <w:pPr>
+        <w:pStyle w:val="ListParagraph"/>
+        <w:numPr>
+          <w:ilvl w:val="0"/>
+          <w:numId w:val="14"/>
+        </w:numPr>
+        <w:spacing w:line="360" w:lineRule="auto"/>
+        <w:rPr>
+          <w:rFonts w:ascii="Cambria" w:hAnsi="Cambria" w:cs="Times New Roman"/>
+          <w:sz w:val="20"/>
+          <w:szCs w:val="20"/>
+        </w:rPr>
+      </w:pPr>
+      <w:r>
+        <w:rPr>
+          <w:rFonts w:ascii="Cambria" w:hAnsi="Cambria" w:cs="Times New Roman"/>
+          <w:b/>
+          <w:bCs/>
+          <w:sz w:val="20"/>
+          <w:szCs w:val="20"/>
+        </w:rPr>
+        <w:t>Collaborated</w:t>
+      </w:r>
+      <w:r>
+        <w:rPr>
+          <w:rFonts w:ascii="Cambria" w:hAnsi="Cambria" w:cs="Times New Roman"/>
+          <w:sz w:val="20"/>
+          <w:szCs w:val="20"/>
+        </w:rPr>
+        <w:t xml:space="preserve"> with cross‑functional team members to expand software development skills while delivering business requirements. </w:t>
+      </w:r>
+    </w:p>
+    <w:p>
+      <w:pPr>
+        <w:pStyle w:val="ListParagraph"/>
+        <w:numPr>
+          <w:ilvl w:val="0"/>
+          <w:numId w:val="14"/>
+        </w:numPr>
+        <w:spacing w:line="360" w:lineRule="auto"/>
+        <w:rPr>
+          <w:rFonts w:ascii="Cambria" w:hAnsi="Cambria" w:cs="Times New Roman"/>
+          <w:sz w:val="20"/>
+          <w:szCs w:val="20"/>
+        </w:rPr>
+      </w:pPr>
+      <w:r>
+        <w:rPr>
+          <w:rFonts w:ascii="Cambria" w:hAnsi="Cambria" w:cs="Times New Roman"/>
+          <w:b/>
+          <w:bCs/>
+          <w:sz w:val="20"/>
+          <w:szCs w:val="20"/>
+        </w:rPr>
+        <w:t>Utilized</w:t>
+      </w:r>
+      <w:r>
+        <w:rPr>
+          <w:rFonts w:ascii="Cambria" w:hAnsi="Cambria" w:cs="Times New Roman"/>
+          <w:sz w:val="20"/>
+          <w:szCs w:val="20"/>
+        </w:rPr>
+        <w:t xml:space="preserve"> Splunk for application monitoring and troubleshooting, resolving user‑reported issues and improving system reliability.</w:t>
+      </w:r>
+    </w:p>
+    <w:p>
+      <w:pPr>
+        <w:spacing w:line="360" w:lineRule="auto"/>
+        <w:rPr>
           <w:rFonts w:ascii="Cambria" w:hAnsi="Cambria"/>
           <w:b/>
           <w:bCs/>
@@ -1138,7 +1817,6 @@
           <w:sz w:val="20"/>
           <w:szCs w:val="20"/>
         </w:rPr>
-        <w:lastRenderedPageBreak/>
         <w:t>Greenway Chemical Systems &amp; Services</w:t>
       </w:r>
       <w:r>
@@ -1355,6 +2033,7 @@
           <w:sz w:val="20"/>
           <w:szCs w:val="20"/>
         </w:rPr>
+        <w:lastRenderedPageBreak/>
         <w:t xml:space="preserve">Engineered </w:t>
       </w:r>
       <w:r>
@@ -2591,6 +3270,119 @@
     </w:lvl>
   </w:abstractNum>
   <w:abstractNum w:abstractNumId="1" w15:restartNumberingAfterBreak="0">
+    <w:nsid w:val="1AE45FBA"/>
+    <w:multiLevelType w:val="hybridMultilevel"/>
+    <w:tmpl w:val="721C2D3A"/>
+    <w:lvl w:ilvl="0" w:tplc="04090001">
+      <w:start w:val="1"/>
+      <w:numFmt w:val="bullet"/>
+      <w:lvlText w:val=""/>
+      <w:lvlJc w:val="left"/>
+      <w:pPr>
+        <w:ind w:left="720" w:hanging="360"/>
+      </w:pPr>
+      <w:rPr>
+        <w:rFonts w:ascii="Symbol" w:hAnsi="Symbol" w:hint="default"/>
+      </w:rPr>
+    </w:lvl>
+    <w:lvl w:ilvl="1" w:tplc="04090003" w:tentative="1">
+      <w:start w:val="1"/>
+      <w:numFmt w:val="bullet"/>
+      <w:lvlText w:val="o"/>
+      <w:lvlJc w:val="left"/>
+      <w:pPr>
+        <w:ind w:left="1440" w:hanging="360"/>
+      </w:pPr>
+      <w:rPr>
+        <w:rFonts w:ascii="Courier New" w:hAnsi="Courier New" w:cs="Courier New" w:hint="default"/>
+      </w:rPr>
+    </w:lvl>
+    <w:lvl w:ilvl="2" w:tplc="04090005" w:tentative="1">
+      <w:start w:val="1"/>
+      <w:numFmt w:val="bullet"/>
+      <w:lvlText w:val=""/>
+      <w:lvlJc w:val="left"/>
+      <w:pPr>
+        <w:ind w:left="2160" w:hanging="360"/>
+      </w:pPr>
+      <w:rPr>
+        <w:rFonts w:ascii="Wingdings" w:hAnsi="Wingdings" w:hint="default"/>
+      </w:rPr>
+    </w:lvl>
+    <w:lvl w:ilvl="3" w:tplc="04090001" w:tentative="1">
+      <w:start w:val="1"/>
+      <w:numFmt w:val="bullet"/>
+      <w:lvlText w:val=""/>
+      <w:lvlJc w:val="left"/>
+      <w:pPr>
+        <w:ind w:left="2880" w:hanging="360"/>
+      </w:pPr>
+      <w:rPr>
+        <w:rFonts w:ascii="Symbol" w:hAnsi="Symbol" w:hint="default"/>
+      </w:rPr>
+    </w:lvl>
+    <w:lvl w:ilvl="4" w:tplc="04090003" w:tentative="1">
+      <w:start w:val="1"/>
+      <w:numFmt w:val="bullet"/>
+      <w:lvlText w:val="o"/>
+      <w:lvlJc w:val="left"/>
+      <w:pPr>
+        <w:ind w:left="3600" w:hanging="360"/>
+      </w:pPr>
+      <w:rPr>
+        <w:rFonts w:ascii="Courier New" w:hAnsi="Courier New" w:cs="Courier New" w:hint="default"/>
+      </w:rPr>
+    </w:lvl>
+    <w:lvl w:ilvl="5" w:tplc="04090005" w:tentative="1">
+      <w:start w:val="1"/>
+      <w:numFmt w:val="bullet"/>
+      <w:lvlText w:val=""/>
+      <w:lvlJc w:val="left"/>
+      <w:pPr>
+        <w:ind w:left="4320" w:hanging="360"/>
+      </w:pPr>
+      <w:rPr>
+        <w:rFonts w:ascii="Wingdings" w:hAnsi="Wingdings" w:hint="default"/>
+      </w:rPr>
+    </w:lvl>
+    <w:lvl w:ilvl="6" w:tplc="04090001" w:tentative="1">
+      <w:start w:val="1"/>
+      <w:numFmt w:val="bullet"/>
+      <w:lvlText w:val=""/>
+      <w:lvlJc w:val="left"/>
+      <w:pPr>
+        <w:ind w:left="5040" w:hanging="360"/>
+      </w:pPr>
+      <w:rPr>
+        <w:rFonts w:ascii="Symbol" w:hAnsi="Symbol" w:hint="default"/>
+      </w:rPr>
+    </w:lvl>
+    <w:lvl w:ilvl="7" w:tplc="04090003" w:tentative="1">
+      <w:start w:val="1"/>
+      <w:numFmt w:val="bullet"/>
+      <w:lvlText w:val="o"/>
+      <w:lvlJc w:val="left"/>
+      <w:pPr>
+        <w:ind w:left="5760" w:hanging="360"/>
+      </w:pPr>
+      <w:rPr>
+        <w:rFonts w:ascii="Courier New" w:hAnsi="Courier New" w:cs="Courier New" w:hint="default"/>
+      </w:rPr>
+    </w:lvl>
+    <w:lvl w:ilvl="8" w:tplc="04090005" w:tentative="1">
+      <w:start w:val="1"/>
+      <w:numFmt w:val="bullet"/>
+      <w:lvlText w:val=""/>
+      <w:lvlJc w:val="left"/>
+      <w:pPr>
+        <w:ind w:left="6480" w:hanging="360"/>
+      </w:pPr>
+      <w:rPr>
+        <w:rFonts w:ascii="Wingdings" w:hAnsi="Wingdings" w:hint="default"/>
+      </w:rPr>
+    </w:lvl>
+  </w:abstractNum>
+  <w:abstractNum w:abstractNumId="2" w15:restartNumberingAfterBreak="0">
     <w:nsid w:val="28EC2CF5"/>
     <w:multiLevelType w:val="hybridMultilevel"/>
     <w:tmpl w:val="F2321AA4"/>
@@ -2703,7 +3495,7 @@
       </w:rPr>
     </w:lvl>
   </w:abstractNum>
-  <w:abstractNum w:abstractNumId="2" w15:restartNumberingAfterBreak="0">
+  <w:abstractNum w:abstractNumId="3" w15:restartNumberingAfterBreak="0">
     <w:nsid w:val="30EA327B"/>
     <w:multiLevelType w:val="hybridMultilevel"/>
     <w:tmpl w:val="CD5CEA42"/>
@@ -2816,7 +3608,119 @@
       </w:rPr>
     </w:lvl>
   </w:abstractNum>
-  <w:abstractNum w:abstractNumId="3" w15:restartNumberingAfterBreak="0">
+  <w:abstractNum w:abstractNumId="4" w15:restartNumberingAfterBreak="0">
+    <w:nsid w:val="31455F4B"/>
+    <w:multiLevelType w:val="hybridMultilevel"/>
+    <w:tmpl w:val="8EF0204A"/>
+    <w:lvl w:ilvl="0" w:tplc="31B444D8">
+      <w:numFmt w:val="bullet"/>
+      <w:lvlText w:val="•"/>
+      <w:lvlJc w:val="left"/>
+      <w:pPr>
+        <w:ind w:left="720" w:hanging="360"/>
+      </w:pPr>
+      <w:rPr>
+        <w:rFonts w:ascii="Cambria" w:eastAsiaTheme="minorHAnsi" w:hAnsi="Cambria" w:cs="Times New Roman" w:hint="default"/>
+      </w:rPr>
+    </w:lvl>
+    <w:lvl w:ilvl="1" w:tplc="04090003" w:tentative="1">
+      <w:start w:val="1"/>
+      <w:numFmt w:val="bullet"/>
+      <w:lvlText w:val="o"/>
+      <w:lvlJc w:val="left"/>
+      <w:pPr>
+        <w:ind w:left="1440" w:hanging="360"/>
+      </w:pPr>
+      <w:rPr>
+        <w:rFonts w:ascii="Courier New" w:hAnsi="Courier New" w:cs="Courier New" w:hint="default"/>
+      </w:rPr>
+    </w:lvl>
+    <w:lvl w:ilvl="2" w:tplc="04090005" w:tentative="1">
+      <w:start w:val="1"/>
+      <w:numFmt w:val="bullet"/>
+      <w:lvlText w:val=""/>
+      <w:lvlJc w:val="left"/>
+      <w:pPr>
+        <w:ind w:left="2160" w:hanging="360"/>
+      </w:pPr>
+      <w:rPr>
+        <w:rFonts w:ascii="Wingdings" w:hAnsi="Wingdings" w:hint="default"/>
+      </w:rPr>
+    </w:lvl>
+    <w:lvl w:ilvl="3" w:tplc="04090001" w:tentative="1">
+      <w:start w:val="1"/>
+      <w:numFmt w:val="bullet"/>
+      <w:lvlText w:val=""/>
+      <w:lvlJc w:val="left"/>
+      <w:pPr>
+        <w:ind w:left="2880" w:hanging="360"/>
+      </w:pPr>
+      <w:rPr>
+        <w:rFonts w:ascii="Symbol" w:hAnsi="Symbol" w:hint="default"/>
+      </w:rPr>
+    </w:lvl>
+    <w:lvl w:ilvl="4" w:tplc="04090003" w:tentative="1">
+      <w:start w:val="1"/>
+      <w:numFmt w:val="bullet"/>
+      <w:lvlText w:val="o"/>
+      <w:lvlJc w:val="left"/>
+      <w:pPr>
+        <w:ind w:left="3600" w:hanging="360"/>
+      </w:pPr>
+      <w:rPr>
+        <w:rFonts w:ascii="Courier New" w:hAnsi="Courier New" w:cs="Courier New" w:hint="default"/>
+      </w:rPr>
+    </w:lvl>
+    <w:lvl w:ilvl="5" w:tplc="04090005" w:tentative="1">
+      <w:start w:val="1"/>
+      <w:numFmt w:val="bullet"/>
+      <w:lvlText w:val=""/>
+      <w:lvlJc w:val="left"/>
+      <w:pPr>
+        <w:ind w:left="4320" w:hanging="360"/>
+      </w:pPr>
+      <w:rPr>
+        <w:rFonts w:ascii="Wingdings" w:hAnsi="Wingdings" w:hint="default"/>
+      </w:rPr>
+    </w:lvl>
+    <w:lvl w:ilvl="6" w:tplc="04090001" w:tentative="1">
+      <w:start w:val="1"/>
+      <w:numFmt w:val="bullet"/>
+      <w:lvlText w:val=""/>
+      <w:lvlJc w:val="left"/>
+      <w:pPr>
+        <w:ind w:left="5040" w:hanging="360"/>
+      </w:pPr>
+      <w:rPr>
+        <w:rFonts w:ascii="Symbol" w:hAnsi="Symbol" w:hint="default"/>
+      </w:rPr>
+    </w:lvl>
+    <w:lvl w:ilvl="7" w:tplc="04090003" w:tentative="1">
+      <w:start w:val="1"/>
+      <w:numFmt w:val="bullet"/>
+      <w:lvlText w:val="o"/>
+      <w:lvlJc w:val="left"/>
+      <w:pPr>
+        <w:ind w:left="5760" w:hanging="360"/>
+      </w:pPr>
+      <w:rPr>
+        <w:rFonts w:ascii="Courier New" w:hAnsi="Courier New" w:cs="Courier New" w:hint="default"/>
+      </w:rPr>
+    </w:lvl>
+    <w:lvl w:ilvl="8" w:tplc="04090005" w:tentative="1">
+      <w:start w:val="1"/>
+      <w:numFmt w:val="bullet"/>
+      <w:lvlText w:val=""/>
+      <w:lvlJc w:val="left"/>
+      <w:pPr>
+        <w:ind w:left="6480" w:hanging="360"/>
+      </w:pPr>
+      <w:rPr>
+        <w:rFonts w:ascii="Wingdings" w:hAnsi="Wingdings" w:hint="default"/>
+      </w:rPr>
+    </w:lvl>
+  </w:abstractNum>
+  <w:abstractNum w:abstractNumId="5" w15:restartNumberingAfterBreak="0">
     <w:nsid w:val="33CF5B52"/>
     <w:multiLevelType w:val="hybridMultilevel"/>
     <w:tmpl w:val="31B2D0C4"/>
@@ -2929,7 +3833,7 @@
       </w:rPr>
     </w:lvl>
   </w:abstractNum>
-  <w:abstractNum w:abstractNumId="4" w15:restartNumberingAfterBreak="0">
+  <w:abstractNum w:abstractNumId="6" w15:restartNumberingAfterBreak="0">
     <w:nsid w:val="3B667383"/>
     <w:multiLevelType w:val="multilevel"/>
     <w:tmpl w:val="4CE66B60"/>
@@ -3078,7 +3982,120 @@
       </w:rPr>
     </w:lvl>
   </w:abstractNum>
-  <w:abstractNum w:abstractNumId="5" w15:restartNumberingAfterBreak="0">
+  <w:abstractNum w:abstractNumId="7" w15:restartNumberingAfterBreak="0">
+    <w:nsid w:val="41C27665"/>
+    <w:multiLevelType w:val="hybridMultilevel"/>
+    <w:tmpl w:val="17A69628"/>
+    <w:lvl w:ilvl="0" w:tplc="04090001">
+      <w:start w:val="1"/>
+      <w:numFmt w:val="bullet"/>
+      <w:lvlText w:val=""/>
+      <w:lvlJc w:val="left"/>
+      <w:pPr>
+        <w:ind w:left="720" w:hanging="360"/>
+      </w:pPr>
+      <w:rPr>
+        <w:rFonts w:ascii="Symbol" w:hAnsi="Symbol" w:hint="default"/>
+      </w:rPr>
+    </w:lvl>
+    <w:lvl w:ilvl="1" w:tplc="04090003" w:tentative="1">
+      <w:start w:val="1"/>
+      <w:numFmt w:val="bullet"/>
+      <w:lvlText w:val="o"/>
+      <w:lvlJc w:val="left"/>
+      <w:pPr>
+        <w:ind w:left="1440" w:hanging="360"/>
+      </w:pPr>
+      <w:rPr>
+        <w:rFonts w:ascii="Courier New" w:hAnsi="Courier New" w:cs="Courier New" w:hint="default"/>
+      </w:rPr>
+    </w:lvl>
+    <w:lvl w:ilvl="2" w:tplc="04090005" w:tentative="1">
+      <w:start w:val="1"/>
+      <w:numFmt w:val="bullet"/>
+      <w:lvlText w:val=""/>
+      <w:lvlJc w:val="left"/>
+      <w:pPr>
+        <w:ind w:left="2160" w:hanging="360"/>
+      </w:pPr>
+      <w:rPr>
+        <w:rFonts w:ascii="Wingdings" w:hAnsi="Wingdings" w:hint="default"/>
+      </w:rPr>
+    </w:lvl>
+    <w:lvl w:ilvl="3" w:tplc="04090001" w:tentative="1">
+      <w:start w:val="1"/>
+      <w:numFmt w:val="bullet"/>
+      <w:lvlText w:val=""/>
+      <w:lvlJc w:val="left"/>
+      <w:pPr>
+        <w:ind w:left="2880" w:hanging="360"/>
+      </w:pPr>
+      <w:rPr>
+        <w:rFonts w:ascii="Symbol" w:hAnsi="Symbol" w:hint="default"/>
+      </w:rPr>
+    </w:lvl>
+    <w:lvl w:ilvl="4" w:tplc="04090003" w:tentative="1">
+      <w:start w:val="1"/>
+      <w:numFmt w:val="bullet"/>
+      <w:lvlText w:val="o"/>
+      <w:lvlJc w:val="left"/>
+      <w:pPr>
+        <w:ind w:left="3600" w:hanging="360"/>
+      </w:pPr>
+      <w:rPr>
+        <w:rFonts w:ascii="Courier New" w:hAnsi="Courier New" w:cs="Courier New" w:hint="default"/>
+      </w:rPr>
+    </w:lvl>
+    <w:lvl w:ilvl="5" w:tplc="04090005" w:tentative="1">
+      <w:start w:val="1"/>
+      <w:numFmt w:val="bullet"/>
+      <w:lvlText w:val=""/>
+      <w:lvlJc w:val="left"/>
+      <w:pPr>
+        <w:ind w:left="4320" w:hanging="360"/>
+      </w:pPr>
+      <w:rPr>
+        <w:rFonts w:ascii="Wingdings" w:hAnsi="Wingdings" w:hint="default"/>
+      </w:rPr>
+    </w:lvl>
+    <w:lvl w:ilvl="6" w:tplc="04090001" w:tentative="1">
+      <w:start w:val="1"/>
+      <w:numFmt w:val="bullet"/>
+      <w:lvlText w:val=""/>
+      <w:lvlJc w:val="left"/>
+      <w:pPr>
+        <w:ind w:left="5040" w:hanging="360"/>
+      </w:pPr>
+      <w:rPr>
+        <w:rFonts w:ascii="Symbol" w:hAnsi="Symbol" w:hint="default"/>
+      </w:rPr>
+    </w:lvl>
+    <w:lvl w:ilvl="7" w:tplc="04090003" w:tentative="1">
+      <w:start w:val="1"/>
+      <w:numFmt w:val="bullet"/>
+      <w:lvlText w:val="o"/>
+      <w:lvlJc w:val="left"/>
+      <w:pPr>
+        <w:ind w:left="5760" w:hanging="360"/>
+      </w:pPr>
+      <w:rPr>
+        <w:rFonts w:ascii="Courier New" w:hAnsi="Courier New" w:cs="Courier New" w:hint="default"/>
+      </w:rPr>
+    </w:lvl>
+    <w:lvl w:ilvl="8" w:tplc="04090005" w:tentative="1">
+      <w:start w:val="1"/>
+      <w:numFmt w:val="bullet"/>
+      <w:lvlText w:val=""/>
+      <w:lvlJc w:val="left"/>
+      <w:pPr>
+        <w:ind w:left="6480" w:hanging="360"/>
+      </w:pPr>
+      <w:rPr>
+        <w:rFonts w:ascii="Wingdings" w:hAnsi="Wingdings" w:hint="default"/>
+      </w:rPr>
+    </w:lvl>
+  </w:abstractNum>
+  <w:abstractNum w:abstractNumId="8" w15:restartNumberingAfterBreak="0">
     <w:nsid w:val="44681A90"/>
     <w:multiLevelType w:val="hybridMultilevel"/>
     <w:tmpl w:val="52B45E34"/>
@@ -3164,7 +4181,7 @@
       </w:pPr>
     </w:lvl>
   </w:abstractNum>
-  <w:abstractNum w:abstractNumId="6" w15:restartNumberingAfterBreak="0">
+  <w:abstractNum w:abstractNumId="9" w15:restartNumberingAfterBreak="0">
     <w:nsid w:val="47C93BAA"/>
     <w:multiLevelType w:val="hybridMultilevel"/>
     <w:tmpl w:val="34389936"/>
@@ -3277,7 +4294,7 @@
       </w:rPr>
     </w:lvl>
   </w:abstractNum>
-  <w:abstractNum w:abstractNumId="7" w15:restartNumberingAfterBreak="0">
+  <w:abstractNum w:abstractNumId="10" w15:restartNumberingAfterBreak="0">
     <w:nsid w:val="4D993608"/>
     <w:multiLevelType w:val="multilevel"/>
     <w:tmpl w:val="FD60ECE8"/>
@@ -3426,7 +4443,7 @@
       </w:rPr>
     </w:lvl>
   </w:abstractNum>
-  <w:abstractNum w:abstractNumId="8" w15:restartNumberingAfterBreak="0">
+  <w:abstractNum w:abstractNumId="11" w15:restartNumberingAfterBreak="0">
     <w:nsid w:val="4E8174D8"/>
     <w:multiLevelType w:val="hybridMultilevel"/>
     <w:tmpl w:val="B3F0AA12"/>
@@ -3539,7 +4556,7 @@
       </w:rPr>
     </w:lvl>
   </w:abstractNum>
-  <w:abstractNum w:abstractNumId="9" w15:restartNumberingAfterBreak="0">
+  <w:abstractNum w:abstractNumId="12" w15:restartNumberingAfterBreak="0">
     <w:nsid w:val="4E9738AB"/>
     <w:multiLevelType w:val="hybridMultilevel"/>
     <w:tmpl w:val="61A8D7E6"/>
@@ -3652,7 +4669,7 @@
       </w:rPr>
     </w:lvl>
   </w:abstractNum>
-  <w:abstractNum w:abstractNumId="10" w15:restartNumberingAfterBreak="0">
+  <w:abstractNum w:abstractNumId="13" w15:restartNumberingAfterBreak="0">
     <w:nsid w:val="53EC5C7F"/>
     <w:multiLevelType w:val="multilevel"/>
     <w:tmpl w:val="7D80F814"/>
@@ -3801,7 +4818,7 @@
       </w:rPr>
     </w:lvl>
   </w:abstractNum>
-  <w:abstractNum w:abstractNumId="11" w15:restartNumberingAfterBreak="0">
+  <w:abstractNum w:abstractNumId="14" w15:restartNumberingAfterBreak="0">
     <w:nsid w:val="55E75164"/>
     <w:multiLevelType w:val="hybridMultilevel"/>
     <w:tmpl w:val="689EFAE2"/>
@@ -3914,7 +4931,7 @@
       </w:rPr>
     </w:lvl>
   </w:abstractNum>
-  <w:abstractNum w:abstractNumId="12" w15:restartNumberingAfterBreak="0">
+  <w:abstractNum w:abstractNumId="15" w15:restartNumberingAfterBreak="0">
     <w:nsid w:val="745656C0"/>
     <w:multiLevelType w:val="hybridMultilevel"/>
     <w:tmpl w:val="7CEA99EA"/>
@@ -4028,43 +5045,52 @@
     </w:lvl>
   </w:abstractNum>
   <w:num w:numId="1" w16cid:durableId="1702172523">
-    <w:abstractNumId w:val="6"/>
+    <w:abstractNumId w:val="9"/>
   </w:num>
   <w:num w:numId="2" w16cid:durableId="772477015">
-    <w:abstractNumId w:val="2"/>
+    <w:abstractNumId w:val="3"/>
   </w:num>
   <w:num w:numId="3" w16cid:durableId="1050572812">
     <w:abstractNumId w:val="0"/>
   </w:num>
   <w:num w:numId="4" w16cid:durableId="1632786237">
-    <w:abstractNumId w:val="3"/>
+    <w:abstractNumId w:val="5"/>
   </w:num>
   <w:num w:numId="5" w16cid:durableId="2130850272">
+    <w:abstractNumId w:val="11"/>
+  </w:num>
+  <w:num w:numId="6" w16cid:durableId="1696492841">
+    <w:abstractNumId w:val="2"/>
+  </w:num>
+  <w:num w:numId="7" w16cid:durableId="1506943172">
+    <w:abstractNumId w:val="15"/>
+  </w:num>
+  <w:num w:numId="8" w16cid:durableId="1897668686">
+    <w:abstractNumId w:val="6"/>
+  </w:num>
+  <w:num w:numId="9" w16cid:durableId="49771436">
+    <w:abstractNumId w:val="14"/>
+  </w:num>
+  <w:num w:numId="10" w16cid:durableId="632442799">
     <w:abstractNumId w:val="8"/>
   </w:num>
-  <w:num w:numId="6" w16cid:durableId="1696492841">
+  <w:num w:numId="11" w16cid:durableId="1650860225">
+    <w:abstractNumId w:val="12"/>
+  </w:num>
+  <w:num w:numId="12" w16cid:durableId="225381039">
+    <w:abstractNumId w:val="10"/>
+  </w:num>
+  <w:num w:numId="13" w16cid:durableId="1333291007">
+    <w:abstractNumId w:val="13"/>
+  </w:num>
+  <w:num w:numId="14" w16cid:durableId="655496040">
+    <w:abstractNumId w:val="7"/>
+  </w:num>
+  <w:num w:numId="15" w16cid:durableId="261375384">
     <w:abstractNumId w:val="1"/>
   </w:num>
-  <w:num w:numId="7" w16cid:durableId="1506943172">
-    <w:abstractNumId w:val="12"/>
-  </w:num>
-  <w:num w:numId="8" w16cid:durableId="1897668686">
+  <w:num w:numId="16" w16cid:durableId="2111581363">
     <w:abstractNumId w:val="4"/>
-  </w:num>
-  <w:num w:numId="9" w16cid:durableId="49771436">
-    <w:abstractNumId w:val="11"/>
-  </w:num>
-  <w:num w:numId="10" w16cid:durableId="632442799">
-    <w:abstractNumId w:val="5"/>
-  </w:num>
-  <w:num w:numId="11" w16cid:durableId="1650860225">
-    <w:abstractNumId w:val="9"/>
-  </w:num>
-  <w:num w:numId="12" w16cid:durableId="225381039">
-    <w:abstractNumId w:val="7"/>
-  </w:num>
-  <w:num w:numId="13" w16cid:durableId="1333291007">
-    <w:abstractNumId w:val="10"/>
   </w:num>
 </w:numbering>
 </file>

</xml_diff>